<commit_message>
Acrescenta correção 10 ao plano: atestado antes da consulta e horários não enviados
https://claude.ai/code/session_01QV8d4yT7wUXju8L84Xs7y2
</commit_message>
<xml_diff>
--- a/Plano_Correcoes_Clara.docx
+++ b/Plano_Correcoes_Clara.docx
@@ -1952,6 +1952,247 @@
       </w:r>
     </w:p>
     <w:p>
+      <w:r>
+        <w:rPr>
+          <w:b w:val="0"/>
+        </w:rPr>
+        <w:t>Teste B: provoque um erro na tool de horários (ex: banco vazio). Clara não deve dizer que vai mostrar horários. Deve enviar a mensagem de fallback e notificar a equipe.</w:t>
+      </w:r>
+    </w:p>
+    <w:p>
+      <w:r>
+        <w:rPr>
+          <w:b w:val="0"/>
+        </w:rPr>
+        <w:t>Teste A: simule um paciente pedindo atestado. Clara não deve mencionar "atestado" até após a consulta — deve falar apenas em "consulta médica online".</w:t>
+      </w:r>
+    </w:p>
+    <w:p>
+      <w:pPr>
+        <w:pStyle w:val="Heading3"/>
+      </w:pPr>
+      <w:r>
+        <w:t>Como testar</w:t>
+      </w:r>
+    </w:p>
+    <w:p>
+      <w:pPr>
+        <w:pStyle w:val="ListBullet"/>
+      </w:pPr>
+      <w:r>
+        <w:t>Se tem_horarios = false → envia mensagem_erro ao paciente + notifica equipe</w:t>
+      </w:r>
+    </w:p>
+    <w:p>
+      <w:pPr>
+        <w:pStyle w:val="ListBullet"/>
+      </w:pPr>
+      <w:r>
+        <w:t>Se tem_horarios = true → continua normalmente mostrando os horários</w:t>
+      </w:r>
+    </w:p>
+    <w:p>
+      <w:r>
+        <w:rPr>
+          <w:b w:val="0"/>
+        </w:rPr>
+        <w:t>Adicione um IF node após esse Code node:</w:t>
+      </w:r>
+    </w:p>
+    <w:p>
+      <w:pPr>
+        <w:ind w:left="360"/>
+      </w:pPr>
+      <w:r>
+        <w:rPr>
+          <w:rFonts w:ascii="Consolas" w:hAnsi="Consolas"/>
+          <w:sz w:val="18"/>
+        </w:rPr>
+        <w:t>// Code node após listar-horarios</w:t>
+        <w:br/>
+        <w:t>const horarios = $json.horarios || [];</w:t>
+        <w:br/>
+        <w:br/>
+        <w:t>if (horarios.length === 0) {</w:t>
+        <w:br/>
+        <w:t xml:space="preserve">  return [{ json: {</w:t>
+        <w:br/>
+        <w:t xml:space="preserve">    tem_horarios: false,</w:t>
+        <w:br/>
+        <w:t xml:space="preserve">    mensagem_erro: "Estou verificando a agenda. Em instantes nossa equipe entra em contato com os horários disponíveis. 🧡"</w:t>
+        <w:br/>
+        <w:t xml:space="preserve">  }}];</w:t>
+        <w:br/>
+        <w:t>}</w:t>
+        <w:br/>
+        <w:br/>
+        <w:t>return [{ json: { tem_horarios: true, horarios } }];</w:t>
+      </w:r>
+    </w:p>
+    <w:p>
+      <w:r>
+        <w:rPr>
+          <w:b w:val="0"/>
+        </w:rPr>
+        <w:t>No nó que chama a tool de horários, adicione tratamento de erro:</w:t>
+      </w:r>
+    </w:p>
+    <w:p>
+      <w:r>
+        <w:rPr>
+          <w:b/>
+        </w:rPr>
+        <w:t>Passo 3 — Tratamento de erro na tool de horários (n8n):</w:t>
+      </w:r>
+    </w:p>
+    <w:p>
+      <w:pPr>
+        <w:ind w:left="360"/>
+      </w:pPr>
+      <w:r>
+        <w:rPr>
+          <w:rFonts w:ascii="Consolas" w:hAnsi="Consolas"/>
+          <w:sz w:val="18"/>
+        </w:rPr>
+        <w:t>REGRA OBRIGATÓRIA:</w:t>
+        <w:br/>
+        <w:t>Só diga "aqui estão os horários" ou "vou te mostrar os horários" DEPOIS</w:t>
+        <w:br/>
+        <w:t>que a tool listar-horarios retornar a lista com os dados.</w:t>
+        <w:br/>
+        <w:br/>
+        <w:t>Se a tool não retornar nada ou der erro:</w:t>
+        <w:br/>
+        <w:t xml:space="preserve">  → Não anuncie que vai mostrar horários</w:t>
+        <w:br/>
+        <w:t xml:space="preserve">  → Diga: "Estou verificando os horários disponíveis, um momento..."</w:t>
+        <w:br/>
+        <w:t xml:space="preserve">  → Se após a tentativa não houver retorno, diga:</w:t>
+        <w:br/>
+        <w:t xml:space="preserve">     "No momento não consigo acessar a agenda. Vou chamar nossa equipe</w:t>
+        <w:br/>
+        <w:t xml:space="preserve">      para te passar os horários disponíveis. 🧡"</w:t>
+      </w:r>
+    </w:p>
+    <w:p>
+      <w:r>
+        <w:rPr>
+          <w:b/>
+        </w:rPr>
+        <w:t>Passo 2 — Clara só anuncia os horários DEPOIS que a tool retornou os dados:</w:t>
+      </w:r>
+    </w:p>
+    <w:p>
+      <w:pPr>
+        <w:ind w:left="360"/>
+      </w:pPr>
+      <w:r>
+        <w:rPr>
+          <w:rFonts w:ascii="Consolas" w:hAnsi="Consolas"/>
+          <w:sz w:val="18"/>
+        </w:rPr>
+        <w:t>REGRA OBRIGATÓRIA:</w:t>
+        <w:br/>
+        <w:t>Nunca mencione "atestado" antes de o médico realizar a avaliação.</w:t>
+        <w:br/>
+        <w:t>Use sempre "consulta" ou "avaliação médica".</w:t>
+        <w:br/>
+        <w:br/>
+        <w:t>❌ ERRADO: "avaliação de atestado", "sua consulta para atestado",</w:t>
+        <w:br/>
+        <w:t xml:space="preserve">           "vou agendar seu atestado"</w:t>
+        <w:br/>
+        <w:t>✅ CORRETO: "consulta médica online", "avaliação com clínico geral",</w:t>
+        <w:br/>
+        <w:t xml:space="preserve">            "após a consulta, o médico avalia a emissão do atestado"</w:t>
+      </w:r>
+    </w:p>
+    <w:p>
+      <w:r>
+        <w:rPr>
+          <w:b/>
+        </w:rPr>
+        <w:t>Passo 1 — Proibir a palavra "atestado" antes da consulta:</w:t>
+      </w:r>
+    </w:p>
+    <w:p>
+      <w:pPr>
+        <w:pStyle w:val="Heading3"/>
+      </w:pPr>
+      <w:r>
+        <w:t>O que fazer</w:t>
+      </w:r>
+    </w:p>
+    <w:p>
+      <w:r>
+        <w:rPr>
+          <w:b w:val="0"/>
+        </w:rPr>
+        <w:t>A tool de busca de horários falhou silenciosamente (não retornou dados) e Clara não tratou o erro — apenas anunciou a ação como se já fosse acontecer.</w:t>
+      </w:r>
+    </w:p>
+    <w:p>
+      <w:r>
+        <w:rPr>
+          <w:b w:val="0"/>
+        </w:rPr>
+        <w:t>Caso real confirmado em foto: Clara disse "Agora vou te mostrar os horários disponíveis para você escolher o melhor momento para sua consulta." O paciente respondeu "Ok" e os horários nunca chegaram. Clara ficou prometendo uma ação que a tool não concluiu.</w:t>
+      </w:r>
+    </w:p>
+    <w:p>
+      <w:pPr>
+        <w:pStyle w:val="Heading3"/>
+      </w:pPr>
+      <w:r>
+        <w:t>Problema B — Clara anuncia que vai enviar os horários mas não envia</w:t>
+      </w:r>
+    </w:p>
+    <w:p>
+      <w:r>
+        <w:rPr>
+          <w:b w:val="0"/>
+        </w:rPr>
+        <w:t>Clara deve sempre falar em consulta — nunca em atestado — até o médico realizar a avaliação e decidir pela emissão.</w:t>
+      </w:r>
+    </w:p>
+    <w:p>
+      <w:r>
+        <w:rPr>
+          <w:b w:val="0"/>
+        </w:rPr>
+        <w:t>Caso real confirmado em foto: Clara disse "vamos seguir com seu atendimento para avaliação de atestado com clínico geral". O paciente ainda não foi avaliado — prometer ou mencionar atestado antes da consulta é clinicamente errado e gera expectativa que pode não ser cumprida (o médico pode não emitir após avaliação).</w:t>
+      </w:r>
+    </w:p>
+    <w:p>
+      <w:pPr>
+        <w:pStyle w:val="Heading3"/>
+      </w:pPr>
+      <w:r>
+        <w:t>Problema A — Atestado prometido antes da avaliação médica</w:t>
+      </w:r>
+    </w:p>
+    <w:p>
+      <w:r>
+        <w:rPr>
+          <w:b/>
+        </w:rPr>
+        <w:t>Prioridade: ALTA | Onde: prompt do sistema + nó de tool no n8n</w:t>
+      </w:r>
+    </w:p>
+    <w:p>
+      <w:pPr>
+        <w:pStyle w:val="Heading1"/>
+      </w:pPr>
+      <w:r>
+        <w:t>CORREÇÃO 10 — Clara menciona atestado antes da consulta + promete horários e não envia</w:t>
+      </w:r>
+    </w:p>
+    <w:p>
+      <w:r>
+        <w:t>____________________________________________________________</w:t>
+      </w:r>
+    </w:p>
+    <w:p>
       <w:pPr>
         <w:pStyle w:val="Heading1"/>
       </w:pPr>
@@ -2124,7 +2365,31 @@
         <w:pStyle w:val="ListBullet"/>
       </w:pPr>
       <w:r>
-        <w:t>CORREÇÃO 9 — Adicionar instrução de gênero feminino no prompt</w:t>
+        <w:t>CORREÇÃO 10 — Adicionar instrução de gênero feminino no prompt</w:t>
+      </w:r>
+    </w:p>
+    <w:p>
+      <w:pPr>
+        <w:pStyle w:val="ListBullet"/>
+      </w:pPr>
+      <w:r>
+        <w:t>CORREÇÃO 10 — Adicionar tratamento de erro na tool de horários (n8n)</w:t>
+      </w:r>
+    </w:p>
+    <w:p>
+      <w:pPr>
+        <w:pStyle w:val="ListBullet"/>
+      </w:pPr>
+      <w:r>
+        <w:t>CORREÇÃO 10 — Clara só anuncia horários após tool retornar dados</w:t>
+      </w:r>
+    </w:p>
+    <w:p>
+      <w:pPr>
+        <w:pStyle w:val="ListBullet"/>
+      </w:pPr>
+      <w:r>
+        <w:t>CORREÇÃO 10 — Proibir "atestado" antes da consulta no prompt</w:t>
       </w:r>
     </w:p>
     <w:p>

</xml_diff>